<commit_message>
Fix 4 factual errors in gazette notifications summary
- 'listed on SSE' corrected to 'registered with SSE' (precise legal term per PDF)
- Removed inaccurate 'before project is complete' qualifier on unspent funds rule
- 'within two days' corrected to 'same day' (both G.S.R. 415 & 416 dated 27 May 2026)
- Removed unverified editorial gloss on sub-rules (5) and (6) exclusion rationale

https://claude.ai/code/session_01BX5PVba57BnDY6CjzvyZqA
</commit_message>
<xml_diff>
--- a/Gazette_Notifications_Summary_May2026.docx
+++ b/Gazette_Notifications_Summary_May2026.docx
@@ -789,7 +789,7 @@
           <w:b w:val="0"/>
           <w:sz w:val="22"/>
         </w:rPr>
-        <w:t>A ZCZP instrument is a unique financial security issued by a Non-Profit Organisation (NPO) listed on India's Social Stock Exchange (SSE). Here's what makes it unusual:</w:t>
+        <w:t>A ZCZP instrument is a unique financial security issued by a Non-Profit Organisation (NPO) registered with India's Social Stock Exchange (SSE). Here's what makes it unusual:</w:t>
       </w:r>
     </w:p>
     <w:p>
@@ -1175,7 +1175,7 @@
           <w:b w:val="0"/>
           <w:sz w:val="22"/>
         </w:rPr>
-        <w:t>Zero Coupon Zero Principal (ZCZP) Instrument: A SEBI-declared security issued by an NPO listed on the Social Stock Exchange segment of a recognised stock exchange — offering no coupon (interest) and no return of principal.</w:t>
+        <w:t>Zero Coupon Zero Principal (ZCZP) Instrument: A SEBI-declared security issued by an NPO registered with the Social Stock Exchange segment of a recognised stock exchange — offering no coupon (interest) and no return of principal.</w:t>
       </w:r>
     </w:p>
     <w:p>
@@ -1298,7 +1298,7 @@
           <w:b w:val="0"/>
           <w:sz w:val="22"/>
         </w:rPr>
-        <w:t>Unspent Funds: If the ZCZP instrument is delisted (terminated) before the project is complete, any unspent funds MUST be transferred to an approved fund listed in Schedule VII of the Companies Act — the money cannot be retained or used for other purposes.</w:t>
+        <w:t>Unspent Funds: On termination of the listing of the ZCZP instrument, any unspent funds MUST be transferred to an approved fund listed in Schedule VII of the Companies Act — the money cannot be retained or used for other purposes.</w:t>
       </w:r>
     </w:p>
     <w:p>
@@ -1339,7 +1339,7 @@
           <w:b w:val="0"/>
           <w:sz w:val="22"/>
         </w:rPr>
-        <w:t>Most of the existing Rule 4 (general CSR implementation rules) applies to ZCZP-based CSR — EXCEPT sub-rules (5) and (6), which deal with unspent CSR account mechanics that are replaced by the specific ZCZP unspent-fund transfer mechanism above.</w:t>
+        <w:t>Most of the existing Rule 4 (general CSR implementation rules) applies to ZCZP-based CSR — EXCEPT sub-rules (5) and (6). This ensures the specific ZCZP unspent-fund and compliance mechanism in Rule 4A(3) takes precedence over those two sub-rules.</w:t>
       </w:r>
     </w:p>
     <w:p>
@@ -1535,7 +1535,7 @@
           <w:color w:val="3C3C3C"/>
           <w:sz w:val="20"/>
         </w:rPr>
-        <w:t xml:space="preserve"> Documents 2 and 3 work together as a package: Document 2 gives legal recognition, Document 3 provides the operational rules. Both were notified within two days of each other and take effect from the date of publication in the Gazette.</w:t>
+        <w:t xml:space="preserve"> Documents 2 and 3 work together as a package: Document 2 gives legal recognition, Document 3 provides the operational rules. Both were notified on the same day (27 May 2026) and take effect from the date of publication in the Gazette.</w:t>
       </w:r>
     </w:p>
     <w:p>

</xml_diff>